<commit_message>
Title history, promotion, and Openet dates
Co-Authored-By: Claude Fable 5.1 <noreply@anthropic.com>
</commit_message>
<xml_diff>
--- a/Wael_Bahgat_Resume.docx
+++ b/Wael_Bahgat_Resume.docx
@@ -294,14 +294,14 @@
           <w:b/>
           <w:color w:val="0D5C8C"/>
         </w:rPr>
-        <w:t xml:space="preserve">Elveo Mobile</w:t>
+        <w:t xml:space="preserve">Elveo Mobile (formerly Lynk Global)</w:t>
       </w:r>
       <w:r>
         <w:rPr>
           <w:i/>
           <w:color w:val="444444"/>
         </w:rPr>
-        <w:t xml:space="preserve">  ·  Direct-to-device satellite operator connecting ordinary mobile phones to satellites.</w:t>
+        <w:t xml:space="preserve">  ·  Direct-to-device satellite operator. Joined as Senior Network Software Engineer; promoted to Principal in 2026.</w:t>
       </w:r>
     </w:p>
     <w:p>
@@ -697,7 +697,7 @@
           <w:sz w:val="20"/>
           <w:szCs w:val="20"/>
         </w:rPr>
-        <w:t xml:space="preserve">May 2012 – Apr 2016</w:t>
+        <w:t xml:space="preserve">Jul 2012 – Apr 2016</w:t>
       </w:r>
     </w:p>
     <w:p>
@@ -766,7 +766,7 @@
           <w:sz w:val="20"/>
           <w:szCs w:val="20"/>
         </w:rPr>
-        <w:t xml:space="preserve">Jan 2005 – May 2012</w:t>
+        <w:t xml:space="preserve">Jan 2005 – Jun 2012</w:t>
       </w:r>
     </w:p>
     <w:p>

</xml_diff>

<commit_message>
Python stated as working knowledge; public résumé rebuilt
</commit_message>
<xml_diff>
--- a/Wael_Bahgat_Resume.docx
+++ b/Wael_Bahgat_Resume.docx
@@ -175,7 +175,7 @@
       </w:r>
       <w:r>
         <w:rPr/>
-        <w:t xml:space="preserve">C++, Qt, Java, Python (tooling and automation), SQL and PL/SQL, Dart/Flutter</w:t>
+        <w:t xml:space="preserve">C++, Qt, Java, SQL and PL/SQL, Dart/Flutter; Python for scripts and tooling</w:t>
       </w:r>
     </w:p>
     <w:p>
@@ -371,7 +371,7 @@
       </w:pPr>
       <w:r>
         <w:rPr/>
-        <w:t xml:space="preserve">Built internal operator tooling (web front end, REST back end, PostgreSQL, Python command-line tool) and introduced software-in-the-loop simulation for testing; mentored an intern through its implementation to delivery.</w:t>
+        <w:t xml:space="preserve">Built internal operator tooling (web front end, REST back end, PostgreSQL, command-line tooling) and introduced software-in-the-loop simulation for testing; mentored an intern through its implementation to delivery.</w:t>
       </w:r>
     </w:p>
     <w:p>

</xml_diff>